<commit_message>
Fleet side ocr issues fixed
</commit_message>
<xml_diff>
--- a/src/fleet/assets/Documents/Raise Authority Letter.docx
+++ b/src/fleet/assets/Documents/Raise Authority Letter.docx
@@ -49,22 +49,18 @@
         <w:spacing w:after="0"/>
       </w:pPr>
       <w:r>
-        <w:t xml:space="preserve">Date:13/07/26 </w:t>
-      </w:r>
-      <w:r>
-        <w:tab/>
-      </w:r>
-      <w:r>
-        <w:tab/>
-      </w:r>
-      <w:r>
+        <w:t xml:space="preserve">Date:16/07/2026 </w:t>
+        <w:tab/>
+        <w:tab/>
         <w:tab/>
         <w:t xml:space="preserve">Company: </w:t>
-      </w:r>
-      <w:r>
         <w:tab/>
         <w:t>Skyline Car Hire (UK) Ltd</w:t>
       </w:r>
+      <w:r/>
+      <w:r/>
+      <w:r/>
+      <w:r/>
     </w:p>
     <w:p>
       <w:pPr>
@@ -338,14 +334,11 @@
       </w:pPr>
       <w:r>
         <w:t>Vehicle Registration:</w:t>
-      </w:r>
-      <w:r>
-        <w:tab/>
-      </w:r>
-      <w:r>
-        <w:tab/>
-        <w:t xml:space="preserve">  </w:t>
-      </w:r>
+        <w:tab/>
+        <w:t>JK20XYZ</w:t>
+      </w:r>
+      <w:r/>
+      <w:r/>
     </w:p>
     <w:p>
       <w:pPr>
@@ -353,17 +346,13 @@
       </w:pPr>
       <w:r>
         <w:t>Make &amp; Model:</w:t>
-      </w:r>
-      <w:r>
-        <w:tab/>
-      </w:r>
-      <w:r>
-        <w:tab/>
-      </w:r>
-      <w:r>
-        <w:tab/>
-        <w:t xml:space="preserve">   </w:t>
-      </w:r>
+        <w:tab/>
+        <w:tab/>
+        <w:t>BMW 1 SERIES SE</w:t>
+      </w:r>
+      <w:r/>
+      <w:r/>
+      <w:r/>
     </w:p>
     <w:p>
       <w:pPr>
@@ -376,17 +365,14 @@
       </w:pPr>
       <w:r>
         <w:t>Driver Name:</w:t>
-      </w:r>
-      <w:r>
-        <w:tab/>
-      </w:r>
-      <w:r>
-        <w:tab/>
-      </w:r>
-      <w:r>
-        <w:tab/>
-        <w:t xml:space="preserve">Mr SabER Mehrabi </w:t>
-      </w:r>
+        <w:tab/>
+        <w:tab/>
+        <w:tab/>
+        <w:t>Mona Lisa</w:t>
+      </w:r>
+      <w:r/>
+      <w:r/>
+      <w:r/>
     </w:p>
     <w:p>
       <w:pPr>
@@ -394,17 +380,14 @@
       </w:pPr>
       <w:r>
         <w:t>Address:</w:t>
-      </w:r>
-      <w:r>
-        <w:tab/>
-      </w:r>
-      <w:r>
-        <w:tab/>
-      </w:r>
-      <w:r>
-        <w:tab/>
-        <w:t xml:space="preserve">54 Highfields court t , Leasowes Drive , WV44PZ </w:t>
-      </w:r>
+        <w:tab/>
+        <w:tab/>
+        <w:tab/>
+        <w:t>9 Anderson Drive Aberdeen Pea, AB15 4ST</w:t>
+      </w:r>
+      <w:r/>
+      <w:r/>
+      <w:r/>
     </w:p>
     <w:p>
       <w:pPr>
@@ -412,28 +395,26 @@
       </w:pPr>
       <w:r>
         <w:t xml:space="preserve">Driving License Number: </w:t>
-      </w:r>
-      <w:r>
-        <w:tab/>
-        <w:t xml:space="preserve">MEHRA901276S99ZM 49 </w:t>
-      </w:r>
-    </w:p>
-    <w:p>
-      <w:pPr>
-        <w:spacing w:after="0"/>
-      </w:pPr>
-    </w:p>
-    <w:p>
-      <w:pPr>
-        <w:spacing w:after="0"/>
-      </w:pPr>
-      <w:r>
-        <w:t xml:space="preserve">Hire Start Date: 13/07/2026 </w:t>
-      </w:r>
-      <w:r>
-        <w:tab/>
-        <w:t xml:space="preserve">Hire End Date: 03/02/2026 </w:t>
-      </w:r>
+        <w:tab/>
+        <w:t xml:space="preserve">LISA753116SM9IJ </w:t>
+      </w:r>
+      <w:r/>
+    </w:p>
+    <w:p>
+      <w:pPr>
+        <w:spacing w:after="0"/>
+      </w:pPr>
+    </w:p>
+    <w:p>
+      <w:pPr>
+        <w:spacing w:after="0"/>
+      </w:pPr>
+      <w:r>
+        <w:t xml:space="preserve">Hire Start Date: 16/07/2026 </w:t>
+        <w:tab/>
+        <w:t>Hire End Date: 11/08/2026 10:15</w:t>
+      </w:r>
+      <w:r/>
     </w:p>
     <w:p>
       <w:pPr>

</xml_diff>

<commit_message>
Fleet listing page and reminder watcher
</commit_message>
<xml_diff>
--- a/src/fleet/assets/Documents/Raise Authority Letter.docx
+++ b/src/fleet/assets/Documents/Raise Authority Letter.docx
@@ -443,72 +443,18 @@
       <w:pPr>
         <w:spacing w:after="0"/>
       </w:pPr>
-      <w:r>
-        <w:rPr>
-          <w:noProof/>
-          <w:lang w:eastAsia="en-GB"/>
-        </w:rPr>
-        <w:drawing>
-          <wp:inline distT="0" distB="0" distL="0" distR="0" wp14:anchorId="05EA34B7" wp14:editId="1FA1EBB1">
-            <wp:extent cx="1463040" cy="419100"/>
-            <wp:effectExtent l="0" t="0" r="0" b="0"/>
-            <wp:docPr id="1" name="Picture 1363161382" descr="A black background with a black squareDescription automatically generated with medium confidence"/>
-            <wp:cNvGraphicFramePr>
-              <a:graphicFrameLocks xmlns:a="http://schemas.openxmlformats.org/drawingml/2006/main" noChangeAspect="1"/>
-            </wp:cNvGraphicFramePr>
-            <a:graphic xmlns:a="http://schemas.openxmlformats.org/drawingml/2006/main">
-              <a:graphicData uri="http://schemas.openxmlformats.org/drawingml/2006/picture">
-                <pic:pic xmlns:pic="http://schemas.openxmlformats.org/drawingml/2006/picture">
-                  <pic:nvPicPr>
-                    <pic:cNvPr id="0" name="Picture 1363161382" descr="A black background with a black squareDescription automatically generated with medium confidence"/>
-                    <pic:cNvPicPr>
-                      <a:picLocks noChangeAspect="1" noChangeArrowheads="1"/>
-                    </pic:cNvPicPr>
-                  </pic:nvPicPr>
-                  <pic:blipFill>
-                    <a:blip r:embed="rId7">
-                      <a:extLst>
-                        <a:ext uri="{28A0092B-C50C-407E-A947-70E740481C1C}">
-                          <a14:useLocalDpi xmlns:a14="http://schemas.microsoft.com/office/drawing/2010/main" val="0"/>
-                        </a:ext>
-                      </a:extLst>
-                    </a:blip>
-                    <a:srcRect/>
-                    <a:stretch>
-                      <a:fillRect/>
-                    </a:stretch>
-                  </pic:blipFill>
-                  <pic:spPr bwMode="auto">
-                    <a:xfrm>
-                      <a:off x="0" y="0"/>
-                      <a:ext cx="1463040" cy="419100"/>
-                    </a:xfrm>
-                    <a:prstGeom prst="rect">
-                      <a:avLst/>
-                    </a:prstGeom>
-                    <a:noFill/>
-                    <a:ln>
-                      <a:noFill/>
-                    </a:ln>
-                  </pic:spPr>
-                </pic:pic>
-              </a:graphicData>
-            </a:graphic>
-          </wp:inline>
-        </w:drawing>
-      </w:r>
-    </w:p>
-    <w:p>
-      <w:pPr>
-        <w:spacing w:after="0"/>
-      </w:pPr>
-    </w:p>
-    <w:p>
-      <w:pPr>
-        <w:spacing w:after="0"/>
-      </w:pPr>
-      <w:r>
-        <w:t>Print Name: Lewis Edge</w:t>
+    </w:p>
+    <w:p>
+      <w:pPr>
+        <w:spacing w:after="0"/>
+      </w:pPr>
+    </w:p>
+    <w:p>
+      <w:pPr>
+        <w:spacing w:after="0"/>
+      </w:pPr>
+      <w:r>
+        <w:t>Print Name: Tariq Hussain</w:t>
       </w:r>
     </w:p>
     <w:p>

</xml_diff>